<commit_message>
Deploy preview for PR 108 🛫
</commit_message>
<xml_diff>
--- a/pr-preview/pr-108/chapters/19-time-varying-treatments-tracked-changes.docx
+++ b/pr-preview/pr-108/chapters/19-time-varying-treatments-tracked-changes.docx
@@ -24640,7 +24640,7 @@
       </w:ins>
       <w:ins w:id="97" w:author="PR Preview" w:date="2024-01-01T00:00:00Z">
         <w:r>
-          <w:t xml:space="preserve">and, by our reading of the open path</w:t>
+          <w:t xml:space="preserve">and the open path</w:t>
         </w:r>
       </w:ins>
       <w:ins w:id="97" w:author="PR Preview" w:date="2024-01-01T00:00:00Z">
@@ -24705,17 +24705,89 @@
       </m:oMath>
       <w:ins w:id="97" w:author="PR Preview" w:date="2024-01-01T00:00:00Z">
         <w:r>
-          <w:t xml:space="preserve">,</w:t>
+          <w:t xml:space="preserve"> </w:t>
         </w:r>
       </w:ins>
       <w:ins w:id="97" w:author="PR Preview" w:date="2024-01-01T00:00:00Z">
         <w:r>
+          <w:t xml:space="preserve">means that</w:t>
+        </w:r>
+      </w:ins>
+      <w:ins w:id="97" w:author="PR Preview" w:date="2024-01-01T00:00:00Z">
+        <w:r>
           <w:t xml:space="preserve"> </w:t>
         </w:r>
       </w:ins>
+      <m:oMath>
+        <m:sSubSup>
+          <m:e>
+            <m:r>
+              <m:t>L</m:t>
+            </m:r>
+          </m:e>
+          <m:sub>
+            <m:r>
+              <m:t>1</m:t>
+            </m:r>
+          </m:sub>
+          <m:sup>
+            <m:r>
+              <m:t>g</m:t>
+            </m:r>
+          </m:sup>
+        </m:sSubSup>
+        <m:r>
+          <m:rPr>
+            <m:sty m:val="p"/>
+          </m:rPr>
+          <m:t>⟂</m:t>
+        </m:r>
+        <m:r>
+          <m:t>​</m:t>
+        </m:r>
+        <m:r>
+          <m:t>​</m:t>
+        </m:r>
+        <m:r>
+          <m:t>​</m:t>
+        </m:r>
+        <m:r>
+          <m:rPr>
+            <m:sty m:val="p"/>
+          </m:rPr>
+          <m:t>⟂</m:t>
+        </m:r>
+        <m:sSub>
+          <m:e>
+            <m:r>
+              <m:t>A</m:t>
+            </m:r>
+          </m:e>
+          <m:sub>
+            <m:r>
+              <m:t>0</m:t>
+            </m:r>
+          </m:sub>
+        </m:sSub>
+      </m:oMath>
       <w:ins w:id="97" w:author="PR Preview" w:date="2024-01-01T00:00:00Z">
         <w:r>
-          <w:t xml:space="preserve">the distribution of</w:t>
+          <w:t xml:space="preserve"> </w:t>
+        </w:r>
+      </w:ins>
+      <w:ins w:id="97" w:author="PR Preview" w:date="2024-01-01T00:00:00Z">
+        <w:r>
+          <w:t xml:space="preserve">generically (under faithfulness) fails,</w:t>
+        </w:r>
+      </w:ins>
+      <w:ins w:id="97" w:author="PR Preview" w:date="2024-01-01T00:00:00Z">
+        <w:r>
+          <w:t xml:space="preserve"> </w:t>
+        </w:r>
+      </w:ins>
+      <w:ins w:id="97" w:author="PR Preview" w:date="2024-01-01T00:00:00Z">
+        <w:r>
+          <w:t xml:space="preserve">so the distribution of</w:t>
         </w:r>
       </w:ins>
       <w:ins w:id="97" w:author="PR Preview" w:date="2024-01-01T00:00:00Z">
@@ -24749,7 +24821,74 @@
       </w:ins>
       <w:ins w:id="97" w:author="PR Preview" w:date="2024-01-01T00:00:00Z">
         <w:r>
-          <w:t xml:space="preserve">is generically (under faithfulness) not identified.</w:t>
+          <w:t xml:space="preserve">cannot be read off the data among those with</w:t>
+        </w:r>
+      </w:ins>
+      <w:ins w:id="97" w:author="PR Preview" w:date="2024-01-01T00:00:00Z">
+        <w:r>
+          <w:t xml:space="preserve"> </w:t>
+        </w:r>
+      </w:ins>
+      <m:oMath>
+        <m:sSub>
+          <m:e>
+            <m:r>
+              <m:t>A</m:t>
+            </m:r>
+          </m:e>
+          <m:sub>
+            <m:r>
+              <m:t>0</m:t>
+            </m:r>
+          </m:sub>
+        </m:sSub>
+        <m:r>
+          <m:rPr>
+            <m:sty m:val="p"/>
+          </m:rPr>
+          <m:t>=</m:t>
+        </m:r>
+        <m:sSub>
+          <m:e>
+            <m:r>
+              <m:t>a</m:t>
+            </m:r>
+          </m:e>
+          <m:sub>
+            <m:r>
+              <m:t>0</m:t>
+            </m:r>
+          </m:sub>
+        </m:sSub>
+      </m:oMath>
+      <w:ins w:id="97" w:author="PR Preview" w:date="2024-01-01T00:00:00Z">
+        <w:r>
+          <w:t xml:space="preserve">;</w:t>
+        </w:r>
+      </w:ins>
+      <w:ins w:id="97" w:author="PR Preview" w:date="2024-01-01T00:00:00Z">
+        <w:r>
+          <w:t xml:space="preserve"> </w:t>
+        </w:r>
+      </w:ins>
+      <w:ins w:id="97" w:author="PR Preview" w:date="2024-01-01T00:00:00Z">
+        <w:r>
+          <w:t xml:space="preserve">the book concludes that it is not identified</w:t>
+        </w:r>
+      </w:ins>
+      <w:ins w:id="97" w:author="PR Preview" w:date="2024-01-01T00:00:00Z">
+        <w:r>
+          <w:t xml:space="preserve"> </w:t>
+        </w:r>
+      </w:ins>
+      <w:ins w:id="97" w:author="PR Preview" w:date="2024-01-01T00:00:00Z">
+        <w:r>
+          <w:t xml:space="preserve">(Hernán and Robins 2020, sec. 19.5)</w:t>
+        </w:r>
+      </w:ins>
+      <w:ins w:id="97" w:author="PR Preview" w:date="2024-01-01T00:00:00Z">
+        <w:r>
+          <w:t xml:space="preserve">.</w:t>
         </w:r>
       </w:ins>
       <w:ins w:id="97" w:author="PR Preview" w:date="2024-01-01T00:00:00Z">

</xml_diff>